<commit_message>
100 vagues progressives calculées par WaveBook, victoire à la 100e (#118) + GDD, journal et prompt
</commit_message>
<xml_diff>
--- a/docs/GDD.docx
+++ b/docs/GDD.docx
@@ -717,7 +717,17 @@
       </w:r>
       <w:r>
         <w:rPr/>
-        <w:t xml:space="preserve"> normal (la couleur indique la résistance), rapide, blindé, cœur (il se regonfle), puis les boss : un gros ballon lent et, pour finir, le dirigeable rouge. 10 vagues.</w:t>
+        <w:t xml:space="preserve"> normal (la couleur indique la résistance), rapide, blindé, cœur (il se regonfle), puis les boss : un gros ballon lent (dès la vague 15) et le dirigeable rouge (vagues 25, 50, 75). </w:t>
+      </w:r>
+      <w:r>
+        <w:rPr>
+          <w:b/>
+        </w:rPr>
+        <w:t xml:space="preserve">100 vagues</w:t>
+      </w:r>
+      <w:r>
+        <w:rPr/>
+        <w:t xml:space="preserve"> de difficulté progressive : chaque sorte de ballon arrive à son palier, puis son nombre et sa solidité montent. La vague 100 (4 dirigeables rouges) donne la victoire, et le mode infini continue ensuite.</w:t>
       </w:r>
     </w:p>
     <w:p>
@@ -1106,7 +1116,7 @@
               <w:rPr>
                 <w:sz w:val="18"/>
               </w:rPr>
-              <w:t xml:space="preserve">1 carte, 1 chemin, 10 vagues + boss final (dirigeable rouge) ✓</w:t>
+              <w:t xml:space="preserve">1 carte, 1 chemin, 100 vagues progressives + finale (dirigeables rouges) ✓</w:t>
             </w:r>
           </w:p>
         </w:tc>

</xml_diff>

<commit_message>
Tutoriel intégré (univers, vague 1 à l'arc, premier singe, bananes, coffre) et prix équilibrés (#32, #120) + GDD, journal et prompt
</commit_message>
<xml_diff>
--- a/docs/GDD.docx
+++ b/docs/GDD.docx
@@ -860,6 +860,273 @@
       <w:r>
         <w:rPr/>
         <w:t xml:space="preserve">des panneaux sur les portes indiquent où elles mènent (BANANERAIE depuis la cabane, CABANE depuis dehors).</w:t>
+      </w:r>
+    </w:p>
+    <w:p>
+      <w:pPr>
+        <w:pStyle w:val="Heading1"/>
+        <w:keepNext/>
+        <w:spacing w:after="80"/>
+      </w:pPr>
+      <w:r>
+        <w:rPr/>
+        <w:t xml:space="preserve">5 bis. Tutoriel (niveau 1)</w:t>
+      </w:r>
+    </w:p>
+    <w:p>
+      <w:pPr>
+        <w:spacing w:after="80"/>
+      </w:pPr>
+      <w:r>
+        <w:rPr/>
+        <w:t xml:space="preserve">Une consigne à la fois, écrite sur des tableaux du décor (suspendu dans la cabane, sur poteaux dans la bananeraie et sur la carte), avec une flèche dorée qui rebondit au-dessus de ce qu'il faut toucher. Chaque étape arrive avec son titre qui surgit, sa consigne écrite lettre par lettre et une gerbe de petits ballons.</w:t>
+      </w:r>
+    </w:p>
+    <w:p>
+      <w:pPr>
+        <w:spacing w:after="80"/>
+      </w:pPr>
+      <w:r>
+        <w:rPr/>
+        <w:t xml:space="preserve">1. </w:t>
+      </w:r>
+      <w:r>
+        <w:rPr>
+          <w:b/>
+        </w:rPr>
+        <w:t xml:space="preserve">L'univers</w:t>
+      </w:r>
+      <w:r>
+        <w:rPr/>
+        <w:t xml:space="preserve"> en trois tableaux (Monkey Lane, l'alerte aux Bloons, « toi, c'est Quincy »), avec un bouton SUIVANT.</w:t>
+      </w:r>
+    </w:p>
+    <w:p>
+      <w:pPr>
+        <w:spacing w:after="80"/>
+      </w:pPr>
+      <w:r>
+        <w:rPr/>
+        <w:t xml:space="preserve">2. </w:t>
+      </w:r>
+      <w:r>
+        <w:rPr>
+          <w:b/>
+        </w:rPr>
+        <w:t xml:space="preserve">La vague 1 à l'arc seul</w:t>
+      </w:r>
+      <w:r>
+        <w:rPr/>
+        <w:t xml:space="preserve"> : SE TP, LANCER, puis tirer. On n'a encore aucun singe.</w:t>
+      </w:r>
+    </w:p>
+    <w:p>
+      <w:pPr>
+        <w:spacing w:after="80"/>
+      </w:pPr>
+      <w:r>
+        <w:rPr/>
+        <w:t xml:space="preserve">3. </w:t>
+      </w:r>
+      <w:r>
+        <w:rPr>
+          <w:b/>
+        </w:rPr>
+        <w:t xml:space="preserve">Le premier singe</w:t>
+      </w:r>
+      <w:r>
+        <w:rPr/>
+        <w:t xml:space="preserve">, offert : on rentre au hub, on le prend dans la bibliothèque et on le pose sur le plateau.</w:t>
+      </w:r>
+    </w:p>
+    <w:p>
+      <w:pPr>
+        <w:spacing w:after="80"/>
+      </w:pPr>
+      <w:r>
+        <w:rPr/>
+        <w:t xml:space="preserve">4. </w:t>
+      </w:r>
+      <w:r>
+        <w:rPr>
+          <w:b/>
+        </w:rPr>
+        <w:t xml:space="preserve">Les bananes</w:t>
+      </w:r>
+      <w:r>
+        <w:rPr/>
+        <w:t xml:space="preserve"> : passer la porte, lancer une banane dans le panier.</w:t>
+      </w:r>
+    </w:p>
+    <w:p>
+      <w:pPr>
+        <w:spacing w:after="80"/>
+      </w:pPr>
+      <w:r>
+        <w:rPr/>
+        <w:t xml:space="preserve">5. </w:t>
+      </w:r>
+      <w:r>
+        <w:rPr>
+          <w:b/>
+        </w:rPr>
+        <w:t xml:space="preserve">Le coffre et la fusion</w:t>
+      </w:r>
+      <w:r>
+        <w:rPr/>
+        <w:t xml:space="preserve">, puis on lance la vague 2 et le tutoriel est fini.</w:t>
+      </w:r>
+    </w:p>
+    <w:p>
+      <w:pPr>
+        <w:spacing w:after="80"/>
+      </w:pPr>
+      <w:r>
+        <w:rPr/>
+        <w:t xml:space="preserve">Un bouton PASSER saute tout (le premier singe est quand même offert).</w:t>
+      </w:r>
+    </w:p>
+    <w:p>
+      <w:pPr>
+        <w:spacing w:after="80"/>
+      </w:pPr>
+      <w:r>
+        <w:rPr>
+          <w:b/>
+        </w:rPr>
+        <w:t xml:space="preserve">Prix (équilibrés le 9 oct.) :</w:t>
+      </w:r>
+    </w:p>
+    <w:p>
+      <w:pPr>
+        <w:spacing w:after="40"/>
+        <w:ind w:left="360" w:hanging="240"/>
+        <w:tabs>
+          <w:tab w:val="left" w:pos="360"/>
+        </w:tabs>
+      </w:pPr>
+      <w:r>
+        <w:t xml:space="preserve">•	</w:t>
+      </w:r>
+      <w:r>
+        <w:rPr>
+          <w:b/>
+        </w:rPr>
+        <w:t xml:space="preserve">Gains :</w:t>
+      </w:r>
+      <w:r>
+        <w:rPr/>
+        <w:t xml:space="preserve"> une banane vaut 5 au départ, une vague finie rapporte 20 + 10 × son numéro.</w:t>
+      </w:r>
+    </w:p>
+    <w:p>
+      <w:pPr>
+        <w:spacing w:after="40"/>
+        <w:ind w:left="360" w:hanging="240"/>
+        <w:tabs>
+          <w:tab w:val="left" w:pos="360"/>
+        </w:tabs>
+      </w:pPr>
+      <w:r>
+        <w:t xml:space="preserve">•	</w:t>
+      </w:r>
+      <w:r>
+        <w:rPr>
+          <w:b/>
+        </w:rPr>
+        <w:t xml:space="preserve">Coffre :</w:t>
+      </w:r>
+      <w:r>
+        <w:rPr/>
+        <w:t xml:space="preserve"> 40, plus 15 par vague vaincue.</w:t>
+      </w:r>
+    </w:p>
+    <w:p>
+      <w:pPr>
+        <w:spacing w:after="40"/>
+        <w:ind w:left="360" w:hanging="240"/>
+        <w:tabs>
+          <w:tab w:val="left" w:pos="360"/>
+        </w:tabs>
+      </w:pPr>
+      <w:r>
+        <w:t xml:space="preserve">•	</w:t>
+      </w:r>
+      <w:r>
+        <w:rPr>
+          <w:b/>
+        </w:rPr>
+        <w:t xml:space="preserve">Déblocage des types :</w:t>
+      </w:r>
+      <w:r>
+        <w:rPr/>
+        <w:t xml:space="preserve"> Boomerang 150, Punaise 200, Glace 300, Canon 400, Colle 500, Sniper 600.</w:t>
+      </w:r>
+    </w:p>
+    <w:p>
+      <w:pPr>
+        <w:spacing w:after="40"/>
+        <w:ind w:left="360" w:hanging="240"/>
+        <w:tabs>
+          <w:tab w:val="left" w:pos="360"/>
+        </w:tabs>
+      </w:pPr>
+      <w:r>
+        <w:t xml:space="preserve">•	</w:t>
+      </w:r>
+      <w:r>
+        <w:rPr>
+          <w:b/>
+        </w:rPr>
+        <w:t xml:space="preserve">Améliorations de l'arc :</w:t>
+      </w:r>
+      <w:r>
+        <w:rPr/>
+        <w:t xml:space="preserve"> de 100 à 1 300.</w:t>
+      </w:r>
+    </w:p>
+    <w:p>
+      <w:pPr>
+        <w:spacing w:after="40"/>
+        <w:ind w:left="360" w:hanging="240"/>
+        <w:tabs>
+          <w:tab w:val="left" w:pos="360"/>
+        </w:tabs>
+      </w:pPr>
+      <w:r>
+        <w:t xml:space="preserve">•	</w:t>
+      </w:r>
+      <w:r>
+        <w:rPr>
+          <w:b/>
+        </w:rPr>
+        <w:t xml:space="preserve">Singes récolteurs :</w:t>
+      </w:r>
+      <w:r>
+        <w:rPr/>
+        <w:t xml:space="preserve"> 150, puis 300, etc.</w:t>
+      </w:r>
+    </w:p>
+    <w:p>
+      <w:pPr>
+        <w:spacing w:after="40"/>
+        <w:ind w:left="360" w:hanging="240"/>
+        <w:tabs>
+          <w:tab w:val="left" w:pos="360"/>
+        </w:tabs>
+      </w:pPr>
+      <w:r>
+        <w:t xml:space="preserve">•	</w:t>
+      </w:r>
+      <w:r>
+        <w:rPr>
+          <w:b/>
+        </w:rPr>
+        <w:t xml:space="preserve">Arbres :</w:t>
+      </w:r>
+      <w:r>
+        <w:rPr/>
+        <w:t xml:space="preserve"> 500, puis 1 500.</w:t>
       </w:r>
     </w:p>
     <w:p>
@@ -1380,14 +1647,7 @@
               <w:rPr>
                 <w:sz w:val="18"/>
               </w:rPr>
-              <w:t xml:space="preserve">Tutoriel avec Pat Fusty (niveau 1) — </w:t>
-            </w:r>
-            <w:r>
-              <w:rPr>
-                <w:b/>
-                <w:sz w:val="18"/>
-              </w:rPr>
-              <w:t xml:space="preserve">à faire</w:t>
+              <w:t xml:space="preserve">Tutoriel intégré (niveau 1) ✓</w:t>
             </w:r>
           </w:p>
         </w:tc>
@@ -1502,7 +1762,7 @@
         <w:rPr>
           <w:i/>
         </w:rPr>
-        <w:t xml:space="preserve">✅ = déjà dans le jeu (à valider au casque). Reste pour S2-S3 : le tutoriel, l'équilibrage, les tests du silence et la stabilité.</w:t>
+        <w:t xml:space="preserve">✅ = déjà dans le jeu (à valider au casque). Reste pour S2-S3 : l'équilibrage, les tests du silence et la stabilité.</w:t>
       </w:r>
     </w:p>
     <w:p>

</xml_diff>